<commit_message>
tranlasi, penskalaan onjek 3D
</commit_message>
<xml_diff>
--- a/laprak/laprak-GF.docx
+++ b/laprak/laprak-GF.docx
@@ -19,7 +19,7 @@
           <w:sz w:val="32"/>
           <w:szCs w:val="32"/>
         </w:rPr>
-        <w:t>PRE-TEST, POST-TESR</w:t>
+        <w:t>Laporan praktikum</w:t>
       </w:r>
     </w:p>
     <w:p>
@@ -32,7 +32,6 @@
           <w:szCs w:val="32"/>
         </w:rPr>
       </w:pPr>
-      <w:proofErr w:type="spellStart"/>
       <w:r>
         <w:rPr>
           <w:b/>
@@ -40,17 +39,7 @@
           <w:sz w:val="32"/>
           <w:szCs w:val="32"/>
         </w:rPr>
-        <w:t>Grafika</w:t>
-      </w:r>
-      <w:proofErr w:type="spellEnd"/>
-      <w:r>
-        <w:rPr>
-          <w:b/>
-          <w:bCs/>
-          <w:sz w:val="32"/>
-          <w:szCs w:val="32"/>
-        </w:rPr>
-        <w:t xml:space="preserve"> computer</w:t>
+        <w:t>Grafika computer</w:t>
       </w:r>
     </w:p>
     <w:p>
@@ -137,23 +126,7 @@
           <w:sz w:val="24"/>
           <w:szCs w:val="24"/>
         </w:rPr>
-        <w:t xml:space="preserve">Di </w:t>
-      </w:r>
-      <w:proofErr w:type="spellStart"/>
-      <w:r>
-        <w:rPr>
-          <w:sz w:val="24"/>
-          <w:szCs w:val="24"/>
-        </w:rPr>
-        <w:t>susun</w:t>
-      </w:r>
-      <w:proofErr w:type="spellEnd"/>
-      <w:r>
-        <w:rPr>
-          <w:sz w:val="24"/>
-          <w:szCs w:val="24"/>
-        </w:rPr>
-        <w:t xml:space="preserve"> oleh:</w:t>
+        <w:t>Di susun oleh:</w:t>
       </w:r>
     </w:p>
     <w:p>
@@ -249,21 +222,12 @@
           <w:szCs w:val="24"/>
         </w:rPr>
       </w:pPr>
-      <w:proofErr w:type="spellStart"/>
       <w:r>
         <w:rPr>
           <w:sz w:val="24"/>
           <w:szCs w:val="24"/>
         </w:rPr>
-        <w:t>Kelas</w:t>
-      </w:r>
-      <w:proofErr w:type="spellEnd"/>
-      <w:r>
-        <w:rPr>
-          <w:sz w:val="24"/>
-          <w:szCs w:val="24"/>
-        </w:rPr>
-        <w:t xml:space="preserve"> </w:t>
+        <w:t xml:space="preserve">Kelas </w:t>
       </w:r>
       <w:r>
         <w:rPr>
@@ -306,23 +270,7 @@
           <w:sz w:val="24"/>
           <w:szCs w:val="24"/>
         </w:rPr>
-        <w:t xml:space="preserve">Program </w:t>
-      </w:r>
-      <w:proofErr w:type="spellStart"/>
-      <w:r>
-        <w:rPr>
-          <w:sz w:val="24"/>
-          <w:szCs w:val="24"/>
-        </w:rPr>
-        <w:t>studi</w:t>
-      </w:r>
-      <w:proofErr w:type="spellEnd"/>
-      <w:r>
-        <w:rPr>
-          <w:sz w:val="24"/>
-          <w:szCs w:val="24"/>
-        </w:rPr>
-        <w:t xml:space="preserve"> </w:t>
+        <w:t xml:space="preserve">Program studi </w:t>
       </w:r>
       <w:r>
         <w:rPr>
@@ -350,74 +298,31 @@
           <w:sz w:val="24"/>
           <w:szCs w:val="24"/>
         </w:rPr>
-        <w:t xml:space="preserve">Teknik </w:t>
+        <w:t>Teknik informatika</w:t>
       </w:r>
-      <w:proofErr w:type="spellStart"/>
+    </w:p>
+    <w:p>
+      <w:pPr>
+        <w:rPr>
+          <w:sz w:val="24"/>
+          <w:szCs w:val="24"/>
+        </w:rPr>
+      </w:pPr>
       <w:r>
         <w:rPr>
           <w:sz w:val="24"/>
           <w:szCs w:val="24"/>
         </w:rPr>
-        <w:t>informatika</w:t>
+        <w:t>Dosen penganpu</w:t>
       </w:r>
-      <w:proofErr w:type="spellEnd"/>
-    </w:p>
-    <w:p>
-      <w:pPr>
-        <w:rPr>
-          <w:sz w:val="24"/>
-          <w:szCs w:val="24"/>
-        </w:rPr>
-      </w:pPr>
-      <w:r>
-        <w:rPr>
-          <w:sz w:val="24"/>
-          <w:szCs w:val="24"/>
-        </w:rPr>
-        <w:t xml:space="preserve">Dosen </w:t>
-      </w:r>
-      <w:proofErr w:type="spellStart"/>
-      <w:r>
-        <w:rPr>
-          <w:sz w:val="24"/>
-          <w:szCs w:val="24"/>
-        </w:rPr>
-        <w:t>penganpu</w:t>
-      </w:r>
-      <w:proofErr w:type="spellEnd"/>
       <w:r>
         <w:rPr>
           <w:sz w:val="24"/>
           <w:szCs w:val="24"/>
         </w:rPr>
         <w:tab/>
-        <w:t xml:space="preserve">: Rio </w:t>
+        <w:t>: Rio Adriansah Krisdiawan.S.Kom.,M.Kom</w:t>
       </w:r>
-      <w:proofErr w:type="spellStart"/>
-      <w:r>
-        <w:rPr>
-          <w:sz w:val="24"/>
-          <w:szCs w:val="24"/>
-        </w:rPr>
-        <w:t>Adriansah</w:t>
-      </w:r>
-      <w:proofErr w:type="spellEnd"/>
-      <w:r>
-        <w:rPr>
-          <w:sz w:val="24"/>
-          <w:szCs w:val="24"/>
-        </w:rPr>
-        <w:t xml:space="preserve"> Krisdiawan.S.Kom.,</w:t>
-      </w:r>
-      <w:proofErr w:type="spellStart"/>
-      <w:r>
-        <w:rPr>
-          <w:sz w:val="24"/>
-          <w:szCs w:val="24"/>
-        </w:rPr>
-        <w:t>M.Kom</w:t>
-      </w:r>
-      <w:proofErr w:type="spellEnd"/>
     </w:p>
     <w:p>
       <w:pPr>
@@ -444,9 +349,19 @@
           <w:sz w:val="32"/>
           <w:szCs w:val="32"/>
         </w:rPr>
-        <w:t xml:space="preserve">Program Studi Teknik </w:t>
+        <w:t xml:space="preserve">Program Studi Teknik Informatika </w:t>
       </w:r>
-      <w:proofErr w:type="spellStart"/>
+    </w:p>
+    <w:p>
+      <w:pPr>
+        <w:jc w:val="center"/>
+        <w:rPr>
+          <w:b/>
+          <w:bCs/>
+          <w:sz w:val="32"/>
+          <w:szCs w:val="32"/>
+        </w:rPr>
+      </w:pPr>
       <w:r>
         <w:rPr>
           <w:b/>
@@ -454,9 +369,19 @@
           <w:sz w:val="32"/>
           <w:szCs w:val="32"/>
         </w:rPr>
-        <w:t>Informatika</w:t>
+        <w:t xml:space="preserve">Fakultas ilmu computer </w:t>
       </w:r>
-      <w:proofErr w:type="spellEnd"/>
+    </w:p>
+    <w:p>
+      <w:pPr>
+        <w:jc w:val="center"/>
+        <w:rPr>
+          <w:b/>
+          <w:bCs/>
+          <w:sz w:val="32"/>
+          <w:szCs w:val="32"/>
+        </w:rPr>
+      </w:pPr>
       <w:r>
         <w:rPr>
           <w:b/>
@@ -464,98 +389,7 @@
           <w:sz w:val="32"/>
           <w:szCs w:val="32"/>
         </w:rPr>
-        <w:t xml:space="preserve"> </w:t>
-      </w:r>
-    </w:p>
-    <w:p>
-      <w:pPr>
-        <w:jc w:val="center"/>
-        <w:rPr>
-          <w:b/>
-          <w:bCs/>
-          <w:sz w:val="32"/>
-          <w:szCs w:val="32"/>
-        </w:rPr>
-      </w:pPr>
-      <w:proofErr w:type="spellStart"/>
-      <w:r>
-        <w:rPr>
-          <w:b/>
-          <w:bCs/>
-          <w:sz w:val="32"/>
-          <w:szCs w:val="32"/>
-        </w:rPr>
-        <w:t>Fakultas</w:t>
-      </w:r>
-      <w:proofErr w:type="spellEnd"/>
-      <w:r>
-        <w:rPr>
-          <w:b/>
-          <w:bCs/>
-          <w:sz w:val="32"/>
-          <w:szCs w:val="32"/>
-        </w:rPr>
-        <w:t xml:space="preserve"> </w:t>
-      </w:r>
-      <w:proofErr w:type="spellStart"/>
-      <w:r>
-        <w:rPr>
-          <w:b/>
-          <w:bCs/>
-          <w:sz w:val="32"/>
-          <w:szCs w:val="32"/>
-        </w:rPr>
-        <w:t>ilmu</w:t>
-      </w:r>
-      <w:proofErr w:type="spellEnd"/>
-      <w:r>
-        <w:rPr>
-          <w:b/>
-          <w:bCs/>
-          <w:sz w:val="32"/>
-          <w:szCs w:val="32"/>
-        </w:rPr>
-        <w:t xml:space="preserve"> computer </w:t>
-      </w:r>
-    </w:p>
-    <w:p>
-      <w:pPr>
-        <w:jc w:val="center"/>
-        <w:rPr>
-          <w:b/>
-          <w:bCs/>
-          <w:sz w:val="32"/>
-          <w:szCs w:val="32"/>
-        </w:rPr>
-      </w:pPr>
-      <w:r>
-        <w:rPr>
-          <w:b/>
-          <w:bCs/>
-          <w:sz w:val="32"/>
-          <w:szCs w:val="32"/>
-        </w:rPr>
-        <w:t xml:space="preserve">Universitas </w:t>
-      </w:r>
-      <w:proofErr w:type="spellStart"/>
-      <w:r>
-        <w:rPr>
-          <w:b/>
-          <w:bCs/>
-          <w:sz w:val="32"/>
-          <w:szCs w:val="32"/>
-        </w:rPr>
-        <w:t>kuningan</w:t>
-      </w:r>
-      <w:proofErr w:type="spellEnd"/>
-      <w:r>
-        <w:rPr>
-          <w:b/>
-          <w:bCs/>
-          <w:sz w:val="32"/>
-          <w:szCs w:val="32"/>
-        </w:rPr>
-        <w:t xml:space="preserve"> </w:t>
+        <w:t xml:space="preserve">Universitas kuningan </w:t>
       </w:r>
     </w:p>
     <w:p>
@@ -620,1790 +454,6 @@
     </w:p>
     <w:p>
       <w:pPr>
-        <w:rPr>
-          <w:sz w:val="32"/>
-          <w:szCs w:val="32"/>
-        </w:rPr>
-      </w:pPr>
-    </w:p>
-    <w:p>
-      <w:pPr>
-        <w:rPr>
-          <w:b/>
-          <w:bCs/>
-          <w:sz w:val="24"/>
-          <w:szCs w:val="24"/>
-        </w:rPr>
-      </w:pPr>
-      <w:r>
-        <w:rPr>
-          <w:b/>
-          <w:bCs/>
-          <w:sz w:val="24"/>
-          <w:szCs w:val="24"/>
-        </w:rPr>
-        <w:lastRenderedPageBreak/>
-        <w:t>PRE-TEST</w:t>
-      </w:r>
-    </w:p>
-    <w:p>
-      <w:pPr>
-        <w:pStyle w:val="ListParagraph"/>
-        <w:numPr>
-          <w:ilvl w:val="0"/>
-          <w:numId w:val="96"/>
-        </w:numPr>
-        <w:ind w:left="709"/>
-      </w:pPr>
-      <w:proofErr w:type="spellStart"/>
-      <w:r>
-        <w:t>Jelaskan</w:t>
-      </w:r>
-      <w:proofErr w:type="spellEnd"/>
-      <w:r>
-        <w:t xml:space="preserve"> </w:t>
-      </w:r>
-      <w:proofErr w:type="spellStart"/>
-      <w:r>
-        <w:t>bagaimana</w:t>
-      </w:r>
-      <w:proofErr w:type="spellEnd"/>
-      <w:r>
-        <w:t xml:space="preserve"> </w:t>
-      </w:r>
-      <w:proofErr w:type="spellStart"/>
-      <w:r>
-        <w:t>matriks</w:t>
-      </w:r>
-      <w:proofErr w:type="spellEnd"/>
-      <w:r>
-        <w:t xml:space="preserve"> </w:t>
-      </w:r>
-      <w:proofErr w:type="spellStart"/>
-      <w:r>
-        <w:t>tranpormasi</w:t>
-      </w:r>
-      <w:proofErr w:type="spellEnd"/>
-      <w:r>
-        <w:t xml:space="preserve"> shear </w:t>
-      </w:r>
-      <w:proofErr w:type="spellStart"/>
-      <w:r>
-        <w:t>digunakan</w:t>
-      </w:r>
-      <w:proofErr w:type="spellEnd"/>
-      <w:r>
-        <w:t xml:space="preserve"> </w:t>
-      </w:r>
-      <w:proofErr w:type="spellStart"/>
-      <w:r>
-        <w:t>untuk</w:t>
-      </w:r>
-      <w:proofErr w:type="spellEnd"/>
-      <w:r>
-        <w:t xml:space="preserve"> </w:t>
-      </w:r>
-      <w:proofErr w:type="spellStart"/>
-      <w:r>
-        <w:t>memanipulasiobken</w:t>
-      </w:r>
-      <w:proofErr w:type="spellEnd"/>
-      <w:r>
-        <w:t xml:space="preserve"> 2D.</w:t>
-      </w:r>
-    </w:p>
-    <w:p>
-      <w:pPr>
-        <w:pStyle w:val="ListParagraph"/>
-        <w:numPr>
-          <w:ilvl w:val="0"/>
-          <w:numId w:val="96"/>
-        </w:numPr>
-        <w:ind w:left="709"/>
-      </w:pPr>
-      <w:proofErr w:type="spellStart"/>
-      <w:r>
-        <w:t>Sebutkan</w:t>
-      </w:r>
-      <w:proofErr w:type="spellEnd"/>
-      <w:r>
-        <w:t xml:space="preserve"> dan </w:t>
-      </w:r>
-      <w:proofErr w:type="spellStart"/>
-      <w:r>
-        <w:t>jelaskan</w:t>
-      </w:r>
-      <w:proofErr w:type="spellEnd"/>
-      <w:r>
-        <w:t xml:space="preserve"> </w:t>
-      </w:r>
-      <w:proofErr w:type="spellStart"/>
-      <w:r>
-        <w:t>perbedaan</w:t>
-      </w:r>
-      <w:proofErr w:type="spellEnd"/>
-      <w:r>
-        <w:t xml:space="preserve"> </w:t>
-      </w:r>
-      <w:proofErr w:type="spellStart"/>
-      <w:r>
-        <w:t>antara</w:t>
-      </w:r>
-      <w:proofErr w:type="spellEnd"/>
-      <w:r>
-        <w:t xml:space="preserve"> shear horizontal dan shear vertical </w:t>
-      </w:r>
-      <w:proofErr w:type="spellStart"/>
-      <w:r>
-        <w:t>dalam</w:t>
-      </w:r>
-      <w:proofErr w:type="spellEnd"/>
-      <w:r>
-        <w:t xml:space="preserve"> </w:t>
-      </w:r>
-      <w:proofErr w:type="spellStart"/>
-      <w:r>
-        <w:t>konteks</w:t>
-      </w:r>
-      <w:proofErr w:type="spellEnd"/>
-      <w:r>
-        <w:t xml:space="preserve"> </w:t>
-      </w:r>
-      <w:proofErr w:type="spellStart"/>
-      <w:r>
-        <w:t>grafika</w:t>
-      </w:r>
-      <w:proofErr w:type="spellEnd"/>
-      <w:r>
-        <w:t xml:space="preserve"> computer.</w:t>
-      </w:r>
-    </w:p>
-    <w:p>
-      <w:pPr>
-        <w:rPr>
-          <w:b/>
-          <w:bCs/>
-        </w:rPr>
-      </w:pPr>
-      <w:proofErr w:type="spellStart"/>
-      <w:r>
-        <w:rPr>
-          <w:b/>
-          <w:bCs/>
-        </w:rPr>
-        <w:t>Jawaban</w:t>
-      </w:r>
-      <w:proofErr w:type="spellEnd"/>
-      <w:r>
-        <w:rPr>
-          <w:b/>
-          <w:bCs/>
-        </w:rPr>
-        <w:t xml:space="preserve"> :</w:t>
-      </w:r>
-    </w:p>
-    <w:p>
-      <w:pPr>
-        <w:pStyle w:val="ListParagraph"/>
-        <w:numPr>
-          <w:ilvl w:val="0"/>
-          <w:numId w:val="98"/>
-        </w:numPr>
-      </w:pPr>
-      <w:proofErr w:type="spellStart"/>
-      <w:r>
-        <w:t>Matriks</w:t>
-      </w:r>
-      <w:proofErr w:type="spellEnd"/>
-      <w:r>
-        <w:t xml:space="preserve"> </w:t>
-      </w:r>
-      <w:r>
-        <w:rPr>
-          <w:i/>
-          <w:iCs/>
-        </w:rPr>
-        <w:t>shear</w:t>
-      </w:r>
-      <w:r>
-        <w:t xml:space="preserve"> </w:t>
-      </w:r>
-      <w:proofErr w:type="spellStart"/>
-      <w:r>
-        <w:t>digunakan</w:t>
-      </w:r>
-      <w:proofErr w:type="spellEnd"/>
-      <w:r>
-        <w:t xml:space="preserve"> </w:t>
-      </w:r>
-      <w:proofErr w:type="spellStart"/>
-      <w:r>
-        <w:t>untuk</w:t>
-      </w:r>
-      <w:proofErr w:type="spellEnd"/>
-      <w:r>
-        <w:t xml:space="preserve"> </w:t>
-      </w:r>
-      <w:proofErr w:type="spellStart"/>
-      <w:r>
-        <w:t>menggeser</w:t>
-      </w:r>
-      <w:proofErr w:type="spellEnd"/>
-      <w:r>
-        <w:t xml:space="preserve"> </w:t>
-      </w:r>
-      <w:proofErr w:type="spellStart"/>
-      <w:r>
-        <w:t>titik-titik</w:t>
-      </w:r>
-      <w:proofErr w:type="spellEnd"/>
-      <w:r>
-        <w:t xml:space="preserve"> pada </w:t>
-      </w:r>
-      <w:proofErr w:type="spellStart"/>
-      <w:r>
-        <w:t>objek</w:t>
-      </w:r>
-      <w:proofErr w:type="spellEnd"/>
-      <w:r>
-        <w:t xml:space="preserve"> </w:t>
-      </w:r>
-      <w:proofErr w:type="spellStart"/>
-      <w:r>
-        <w:t>dalam</w:t>
-      </w:r>
-      <w:proofErr w:type="spellEnd"/>
-      <w:r>
-        <w:t xml:space="preserve"> </w:t>
-      </w:r>
-      <w:proofErr w:type="spellStart"/>
-      <w:r>
-        <w:t>arah</w:t>
-      </w:r>
-      <w:proofErr w:type="spellEnd"/>
-      <w:r>
-        <w:t xml:space="preserve"> </w:t>
-      </w:r>
-      <w:proofErr w:type="spellStart"/>
-      <w:r>
-        <w:t>tertentu</w:t>
-      </w:r>
-      <w:proofErr w:type="spellEnd"/>
-      <w:r>
-        <w:t xml:space="preserve"> </w:t>
-      </w:r>
-      <w:proofErr w:type="spellStart"/>
-      <w:r>
-        <w:t>berdasarkan</w:t>
-      </w:r>
-      <w:proofErr w:type="spellEnd"/>
-      <w:r>
-        <w:t xml:space="preserve"> </w:t>
-      </w:r>
-      <w:proofErr w:type="spellStart"/>
-      <w:r>
-        <w:t>jarak</w:t>
-      </w:r>
-      <w:proofErr w:type="spellEnd"/>
-      <w:r>
-        <w:t xml:space="preserve"> </w:t>
-      </w:r>
-      <w:proofErr w:type="spellStart"/>
-      <w:r>
-        <w:t>titik</w:t>
-      </w:r>
-      <w:proofErr w:type="spellEnd"/>
-      <w:r>
-        <w:t xml:space="preserve"> </w:t>
-      </w:r>
-      <w:proofErr w:type="spellStart"/>
-      <w:r>
-        <w:t>tersebut</w:t>
-      </w:r>
-      <w:proofErr w:type="spellEnd"/>
-      <w:r>
-        <w:t xml:space="preserve"> </w:t>
-      </w:r>
-      <w:proofErr w:type="spellStart"/>
-      <w:r>
-        <w:t>dari</w:t>
-      </w:r>
-      <w:proofErr w:type="spellEnd"/>
-      <w:r>
-        <w:t xml:space="preserve"> </w:t>
-      </w:r>
-      <w:proofErr w:type="spellStart"/>
-      <w:r>
-        <w:t>sumbu</w:t>
-      </w:r>
-      <w:proofErr w:type="spellEnd"/>
-      <w:r>
-        <w:t xml:space="preserve"> </w:t>
-      </w:r>
-      <w:proofErr w:type="spellStart"/>
-      <w:r>
-        <w:t>koordinat</w:t>
-      </w:r>
-      <w:proofErr w:type="spellEnd"/>
-      <w:r>
-        <w:t xml:space="preserve">. </w:t>
-      </w:r>
-      <w:proofErr w:type="spellStart"/>
-      <w:r>
-        <w:t>Intinya</w:t>
-      </w:r>
-      <w:proofErr w:type="spellEnd"/>
-      <w:r>
-        <w:t xml:space="preserve">, </w:t>
-      </w:r>
-      <w:proofErr w:type="spellStart"/>
-      <w:r>
-        <w:t>semakin</w:t>
-      </w:r>
-      <w:proofErr w:type="spellEnd"/>
-      <w:r>
-        <w:t xml:space="preserve"> </w:t>
-      </w:r>
-      <w:proofErr w:type="spellStart"/>
-      <w:r>
-        <w:t>jauh</w:t>
-      </w:r>
-      <w:proofErr w:type="spellEnd"/>
-      <w:r>
-        <w:t xml:space="preserve"> </w:t>
-      </w:r>
-      <w:proofErr w:type="spellStart"/>
-      <w:r>
-        <w:t>posisi</w:t>
-      </w:r>
-      <w:proofErr w:type="spellEnd"/>
-      <w:r>
-        <w:t xml:space="preserve"> </w:t>
-      </w:r>
-      <w:proofErr w:type="spellStart"/>
-      <w:r>
-        <w:t>suatu</w:t>
-      </w:r>
-      <w:proofErr w:type="spellEnd"/>
-      <w:r>
-        <w:t xml:space="preserve"> </w:t>
-      </w:r>
-      <w:proofErr w:type="spellStart"/>
-      <w:r>
-        <w:t>titik</w:t>
-      </w:r>
-      <w:proofErr w:type="spellEnd"/>
-      <w:r>
-        <w:t xml:space="preserve"> </w:t>
-      </w:r>
-      <w:proofErr w:type="spellStart"/>
-      <w:r>
-        <w:t>dari</w:t>
-      </w:r>
-      <w:proofErr w:type="spellEnd"/>
-      <w:r>
-        <w:t xml:space="preserve"> </w:t>
-      </w:r>
-      <w:proofErr w:type="spellStart"/>
-      <w:r>
-        <w:t>titik</w:t>
-      </w:r>
-      <w:proofErr w:type="spellEnd"/>
-      <w:r>
-        <w:t xml:space="preserve"> </w:t>
-      </w:r>
-      <w:proofErr w:type="spellStart"/>
-      <w:r>
-        <w:t>pusat</w:t>
-      </w:r>
-      <w:proofErr w:type="spellEnd"/>
-      <w:r>
-        <w:t xml:space="preserve"> (origin) pada </w:t>
-      </w:r>
-      <w:proofErr w:type="spellStart"/>
-      <w:r>
-        <w:t>satu</w:t>
-      </w:r>
-      <w:proofErr w:type="spellEnd"/>
-      <w:r>
-        <w:t xml:space="preserve"> </w:t>
-      </w:r>
-      <w:proofErr w:type="spellStart"/>
-      <w:r>
-        <w:t>sumbu</w:t>
-      </w:r>
-      <w:proofErr w:type="spellEnd"/>
-      <w:r>
-        <w:t xml:space="preserve">, </w:t>
-      </w:r>
-      <w:proofErr w:type="spellStart"/>
-      <w:r>
-        <w:t>semakin</w:t>
-      </w:r>
-      <w:proofErr w:type="spellEnd"/>
-      <w:r>
-        <w:t xml:space="preserve"> </w:t>
-      </w:r>
-      <w:proofErr w:type="spellStart"/>
-      <w:r>
-        <w:t>besar</w:t>
-      </w:r>
-      <w:proofErr w:type="spellEnd"/>
-      <w:r>
-        <w:t xml:space="preserve"> </w:t>
-      </w:r>
-      <w:proofErr w:type="spellStart"/>
-      <w:r>
-        <w:t>pergeseran</w:t>
-      </w:r>
-      <w:proofErr w:type="spellEnd"/>
-      <w:r>
-        <w:t xml:space="preserve"> yang </w:t>
-      </w:r>
-      <w:proofErr w:type="spellStart"/>
-      <w:r>
-        <w:t>dialaminya</w:t>
-      </w:r>
-      <w:proofErr w:type="spellEnd"/>
-      <w:r>
-        <w:t xml:space="preserve"> pada </w:t>
-      </w:r>
-      <w:proofErr w:type="spellStart"/>
-      <w:r>
-        <w:t>sumbu</w:t>
-      </w:r>
-      <w:proofErr w:type="spellEnd"/>
-      <w:r>
-        <w:t xml:space="preserve"> </w:t>
-      </w:r>
-      <w:proofErr w:type="spellStart"/>
-      <w:r>
-        <w:t>lainnya</w:t>
-      </w:r>
-      <w:proofErr w:type="spellEnd"/>
-      <w:r>
-        <w:t>.</w:t>
-      </w:r>
-    </w:p>
-    <w:p>
-      <w:pPr>
-        <w:pStyle w:val="ListParagraph"/>
-        <w:numPr>
-          <w:ilvl w:val="0"/>
-          <w:numId w:val="98"/>
-        </w:numPr>
-      </w:pPr>
-      <w:proofErr w:type="spellStart"/>
-      <w:r>
-        <w:t>Perbedaan</w:t>
-      </w:r>
-      <w:proofErr w:type="spellEnd"/>
-      <w:r>
-        <w:t xml:space="preserve"> </w:t>
-      </w:r>
-      <w:proofErr w:type="spellStart"/>
-      <w:r>
-        <w:t>utama</w:t>
-      </w:r>
-      <w:proofErr w:type="spellEnd"/>
-      <w:r>
-        <w:t xml:space="preserve"> </w:t>
-      </w:r>
-      <w:proofErr w:type="spellStart"/>
-      <w:r>
-        <w:t>antara</w:t>
-      </w:r>
-      <w:proofErr w:type="spellEnd"/>
-      <w:r>
-        <w:t xml:space="preserve"> </w:t>
-      </w:r>
-      <w:proofErr w:type="spellStart"/>
-      <w:r>
-        <w:t>keduanya</w:t>
-      </w:r>
-      <w:proofErr w:type="spellEnd"/>
-      <w:r>
-        <w:t xml:space="preserve"> </w:t>
-      </w:r>
-      <w:proofErr w:type="spellStart"/>
-      <w:r>
-        <w:t>terletak</w:t>
-      </w:r>
-      <w:proofErr w:type="spellEnd"/>
-      <w:r>
-        <w:t xml:space="preserve"> pada </w:t>
-      </w:r>
-      <w:proofErr w:type="spellStart"/>
-      <w:r>
-        <w:t>sumbu</w:t>
-      </w:r>
-      <w:proofErr w:type="spellEnd"/>
-      <w:r>
-        <w:t xml:space="preserve"> mana yang </w:t>
-      </w:r>
-      <w:proofErr w:type="spellStart"/>
-      <w:r>
-        <w:t>nilainya</w:t>
-      </w:r>
-      <w:proofErr w:type="spellEnd"/>
-      <w:r>
-        <w:t xml:space="preserve"> </w:t>
-      </w:r>
-      <w:proofErr w:type="spellStart"/>
-      <w:r>
-        <w:t>tetap</w:t>
-      </w:r>
-      <w:proofErr w:type="spellEnd"/>
-      <w:r>
-        <w:t xml:space="preserve"> (statis) dan </w:t>
-      </w:r>
-      <w:proofErr w:type="spellStart"/>
-      <w:r>
-        <w:t>sumbu</w:t>
-      </w:r>
-      <w:proofErr w:type="spellEnd"/>
-      <w:r>
-        <w:t xml:space="preserve"> mana yang </w:t>
-      </w:r>
-      <w:proofErr w:type="spellStart"/>
-      <w:r>
-        <w:t>nilainya</w:t>
-      </w:r>
-      <w:proofErr w:type="spellEnd"/>
-      <w:r>
-        <w:t xml:space="preserve"> </w:t>
-      </w:r>
-      <w:proofErr w:type="spellStart"/>
-      <w:r>
-        <w:t>berubah</w:t>
-      </w:r>
-      <w:proofErr w:type="spellEnd"/>
-      <w:r>
-        <w:t xml:space="preserve"> </w:t>
-      </w:r>
-      <w:proofErr w:type="spellStart"/>
-      <w:r>
-        <w:t>secara</w:t>
-      </w:r>
-      <w:proofErr w:type="spellEnd"/>
-      <w:r>
-        <w:t xml:space="preserve"> </w:t>
-      </w:r>
-      <w:proofErr w:type="spellStart"/>
-      <w:r>
-        <w:t>proporsional</w:t>
-      </w:r>
-      <w:proofErr w:type="spellEnd"/>
-      <w:r>
-        <w:t>.</w:t>
-      </w:r>
-    </w:p>
-    <w:p>
-      <w:pPr>
-        <w:pStyle w:val="ListParagraph"/>
-        <w:numPr>
-          <w:ilvl w:val="0"/>
-          <w:numId w:val="99"/>
-        </w:numPr>
-      </w:pPr>
-      <w:r>
-        <w:t>Horizontal Shear (Geser Horizontal)</w:t>
-      </w:r>
-    </w:p>
-    <w:p>
-      <w:pPr>
-        <w:pStyle w:val="ListParagraph"/>
-        <w:ind w:left="1440"/>
-      </w:pPr>
-      <w:r>
-        <w:t xml:space="preserve">Pada </w:t>
-      </w:r>
-      <w:r>
-        <w:rPr>
-          <w:i/>
-          <w:iCs/>
-        </w:rPr>
-        <w:t>shear</w:t>
-      </w:r>
-      <w:r>
-        <w:t xml:space="preserve"> horizontal, </w:t>
-      </w:r>
-      <w:proofErr w:type="spellStart"/>
-      <w:r>
-        <w:t>posisi</w:t>
-      </w:r>
-      <w:proofErr w:type="spellEnd"/>
-      <w:r>
-        <w:t xml:space="preserve"> $y$ </w:t>
-      </w:r>
-      <w:proofErr w:type="spellStart"/>
-      <w:r>
-        <w:t>dari</w:t>
-      </w:r>
-      <w:proofErr w:type="spellEnd"/>
-      <w:r>
-        <w:t xml:space="preserve"> </w:t>
-      </w:r>
-      <w:proofErr w:type="spellStart"/>
-      <w:r>
-        <w:t>setiap</w:t>
-      </w:r>
-      <w:proofErr w:type="spellEnd"/>
-      <w:r>
-        <w:t xml:space="preserve"> </w:t>
-      </w:r>
-      <w:proofErr w:type="spellStart"/>
-      <w:r>
-        <w:t>titik</w:t>
-      </w:r>
-      <w:proofErr w:type="spellEnd"/>
-      <w:r>
-        <w:t xml:space="preserve"> </w:t>
-      </w:r>
-      <w:proofErr w:type="spellStart"/>
-      <w:r>
-        <w:t>tetap</w:t>
-      </w:r>
-      <w:proofErr w:type="spellEnd"/>
-      <w:r>
-        <w:t xml:space="preserve"> </w:t>
-      </w:r>
-      <w:proofErr w:type="spellStart"/>
-      <w:r>
-        <w:t>konstan</w:t>
-      </w:r>
-      <w:proofErr w:type="spellEnd"/>
-      <w:r>
-        <w:t xml:space="preserve">, </w:t>
-      </w:r>
-      <w:proofErr w:type="spellStart"/>
-      <w:r>
-        <w:t>sementara</w:t>
-      </w:r>
-      <w:proofErr w:type="spellEnd"/>
-      <w:r>
-        <w:t xml:space="preserve"> </w:t>
-      </w:r>
-      <w:proofErr w:type="spellStart"/>
-      <w:r>
-        <w:t>posisi</w:t>
-      </w:r>
-      <w:proofErr w:type="spellEnd"/>
-      <w:r>
-        <w:t xml:space="preserve"> x digeser </w:t>
-      </w:r>
-      <w:proofErr w:type="spellStart"/>
-      <w:r>
-        <w:t>sejauh</w:t>
-      </w:r>
-      <w:proofErr w:type="spellEnd"/>
-      <w:r>
-        <w:t xml:space="preserve"> </w:t>
-      </w:r>
-      <w:proofErr w:type="spellStart"/>
-      <w:r>
-        <w:t>nilai</w:t>
-      </w:r>
-      <w:proofErr w:type="spellEnd"/>
-      <w:r>
-        <w:t xml:space="preserve"> yang </w:t>
-      </w:r>
-      <w:proofErr w:type="spellStart"/>
-      <w:r>
-        <w:t>proporsional</w:t>
-      </w:r>
-      <w:proofErr w:type="spellEnd"/>
-      <w:r>
-        <w:t xml:space="preserve"> </w:t>
-      </w:r>
-      <w:proofErr w:type="spellStart"/>
-      <w:r>
-        <w:t>dengan</w:t>
-      </w:r>
-      <w:proofErr w:type="spellEnd"/>
-      <w:r>
-        <w:t xml:space="preserve"> </w:t>
-      </w:r>
-      <w:proofErr w:type="spellStart"/>
-      <w:r>
-        <w:t>nilai</w:t>
-      </w:r>
-      <w:proofErr w:type="spellEnd"/>
-      <w:r>
-        <w:t xml:space="preserve"> y-</w:t>
-      </w:r>
-      <w:proofErr w:type="spellStart"/>
-      <w:r>
-        <w:t>nya</w:t>
-      </w:r>
-      <w:proofErr w:type="spellEnd"/>
-      <w:r>
-        <w:t>.</w:t>
-      </w:r>
-    </w:p>
-    <w:p>
-      <w:pPr>
-        <w:pStyle w:val="ListParagraph"/>
-        <w:ind w:left="1440"/>
-      </w:pPr>
-      <w:proofErr w:type="spellStart"/>
-      <w:r>
-        <w:rPr>
-          <w:b/>
-          <w:bCs/>
-        </w:rPr>
-        <w:t>Efek</w:t>
-      </w:r>
-      <w:proofErr w:type="spellEnd"/>
-      <w:r>
-        <w:rPr>
-          <w:b/>
-          <w:bCs/>
-        </w:rPr>
-        <w:t>:</w:t>
-      </w:r>
-      <w:r>
-        <w:t xml:space="preserve"> </w:t>
-      </w:r>
-      <w:proofErr w:type="spellStart"/>
-      <w:r>
-        <w:t>Objek</w:t>
-      </w:r>
-      <w:proofErr w:type="spellEnd"/>
-      <w:r>
-        <w:t xml:space="preserve"> </w:t>
-      </w:r>
-      <w:proofErr w:type="spellStart"/>
-      <w:r>
-        <w:t>tampak</w:t>
-      </w:r>
-      <w:proofErr w:type="spellEnd"/>
-      <w:r>
-        <w:t xml:space="preserve"> "miring" </w:t>
-      </w:r>
-      <w:proofErr w:type="spellStart"/>
-      <w:r>
-        <w:t>ke</w:t>
-      </w:r>
-      <w:proofErr w:type="spellEnd"/>
-      <w:r>
-        <w:t xml:space="preserve"> </w:t>
-      </w:r>
-      <w:proofErr w:type="spellStart"/>
-      <w:r>
-        <w:t>arah</w:t>
-      </w:r>
-      <w:proofErr w:type="spellEnd"/>
-      <w:r>
-        <w:t xml:space="preserve"> </w:t>
-      </w:r>
-      <w:proofErr w:type="spellStart"/>
-      <w:r>
-        <w:t>samping</w:t>
-      </w:r>
-      <w:proofErr w:type="spellEnd"/>
-      <w:r>
-        <w:t xml:space="preserve"> (kiri </w:t>
-      </w:r>
-      <w:proofErr w:type="spellStart"/>
-      <w:r>
-        <w:t>atau</w:t>
-      </w:r>
-      <w:proofErr w:type="spellEnd"/>
-      <w:r>
-        <w:t xml:space="preserve"> </w:t>
-      </w:r>
-      <w:proofErr w:type="spellStart"/>
-      <w:r>
-        <w:t>kanan</w:t>
-      </w:r>
-      <w:proofErr w:type="spellEnd"/>
-      <w:r>
-        <w:t xml:space="preserve">). Garis-garis horizontal pada </w:t>
-      </w:r>
-      <w:proofErr w:type="spellStart"/>
-      <w:r>
-        <w:t>objek</w:t>
-      </w:r>
-      <w:proofErr w:type="spellEnd"/>
-      <w:r>
-        <w:t xml:space="preserve"> </w:t>
-      </w:r>
-      <w:proofErr w:type="spellStart"/>
-      <w:r>
-        <w:t>akan</w:t>
-      </w:r>
-      <w:proofErr w:type="spellEnd"/>
-      <w:r>
-        <w:t xml:space="preserve"> </w:t>
-      </w:r>
-      <w:proofErr w:type="spellStart"/>
-      <w:r>
-        <w:t>tetap</w:t>
-      </w:r>
-      <w:proofErr w:type="spellEnd"/>
-      <w:r>
-        <w:t xml:space="preserve"> horizontal, </w:t>
-      </w:r>
-      <w:proofErr w:type="spellStart"/>
-      <w:r>
-        <w:t>tetapi</w:t>
-      </w:r>
-      <w:proofErr w:type="spellEnd"/>
-      <w:r>
-        <w:t xml:space="preserve"> garis-garis </w:t>
-      </w:r>
-      <w:proofErr w:type="spellStart"/>
-      <w:r>
-        <w:t>vertikal</w:t>
-      </w:r>
-      <w:proofErr w:type="spellEnd"/>
-      <w:r>
-        <w:t xml:space="preserve"> </w:t>
-      </w:r>
-      <w:proofErr w:type="spellStart"/>
-      <w:r>
-        <w:t>akan</w:t>
-      </w:r>
-      <w:proofErr w:type="spellEnd"/>
-      <w:r>
-        <w:t xml:space="preserve"> </w:t>
-      </w:r>
-      <w:proofErr w:type="spellStart"/>
-      <w:r>
-        <w:t>menjadi</w:t>
-      </w:r>
-      <w:proofErr w:type="spellEnd"/>
-      <w:r>
-        <w:t xml:space="preserve"> miring</w:t>
-      </w:r>
-      <w:r>
-        <w:t>.</w:t>
-      </w:r>
-    </w:p>
-    <w:p>
-      <w:pPr>
-        <w:pStyle w:val="ListParagraph"/>
-        <w:numPr>
-          <w:ilvl w:val="0"/>
-          <w:numId w:val="99"/>
-        </w:numPr>
-      </w:pPr>
-      <w:r>
-        <w:t xml:space="preserve">Vertical Shear (Geser </w:t>
-      </w:r>
-      <w:proofErr w:type="spellStart"/>
-      <w:r>
-        <w:t>Vertikal</w:t>
-      </w:r>
-      <w:proofErr w:type="spellEnd"/>
-      <w:r>
-        <w:t>)</w:t>
-      </w:r>
-    </w:p>
-    <w:p>
-      <w:pPr>
-        <w:pStyle w:val="ListParagraph"/>
-        <w:spacing w:after="0" w:line="240" w:lineRule="auto"/>
-        <w:ind w:left="1440"/>
-        <w:rPr>
-          <w:rFonts w:ascii="Times New Roman" w:eastAsia="Times New Roman" w:hAnsi="Times New Roman" w:cs="Times New Roman"/>
-          <w:kern w:val="0"/>
-          <w:sz w:val="28"/>
-          <w:szCs w:val="28"/>
-          <w:lang w:eastAsia="en-ID"/>
-          <w14:ligatures w14:val="none"/>
-        </w:rPr>
-      </w:pPr>
-      <w:r>
-        <w:rPr>
-          <w:rFonts w:ascii="Times New Roman" w:eastAsia="Times New Roman" w:hAnsi="Times New Roman" w:cs="Times New Roman"/>
-          <w:kern w:val="0"/>
-          <w:sz w:val="28"/>
-          <w:szCs w:val="28"/>
-          <w:lang w:eastAsia="en-ID"/>
-          <w14:ligatures w14:val="none"/>
-        </w:rPr>
-        <w:t xml:space="preserve">Pada </w:t>
-      </w:r>
-      <w:r>
-        <w:rPr>
-          <w:rFonts w:ascii="Arial" w:eastAsia="Times New Roman" w:hAnsi="Arial" w:cs="Arial"/>
-          <w:i/>
-          <w:iCs/>
-          <w:kern w:val="0"/>
-          <w:sz w:val="28"/>
-          <w:szCs w:val="28"/>
-          <w:lang w:eastAsia="en-ID"/>
-          <w14:ligatures w14:val="none"/>
-        </w:rPr>
-        <w:t>shear</w:t>
-      </w:r>
-      <w:r>
-        <w:rPr>
-          <w:rFonts w:ascii="Times New Roman" w:eastAsia="Times New Roman" w:hAnsi="Times New Roman" w:cs="Times New Roman"/>
-          <w:kern w:val="0"/>
-          <w:sz w:val="28"/>
-          <w:szCs w:val="28"/>
-          <w:lang w:eastAsia="en-ID"/>
-          <w14:ligatures w14:val="none"/>
-        </w:rPr>
-        <w:t xml:space="preserve"> </w:t>
-      </w:r>
-      <w:proofErr w:type="spellStart"/>
-      <w:r>
-        <w:rPr>
-          <w:rFonts w:ascii="Times New Roman" w:eastAsia="Times New Roman" w:hAnsi="Times New Roman" w:cs="Times New Roman"/>
-          <w:kern w:val="0"/>
-          <w:sz w:val="28"/>
-          <w:szCs w:val="28"/>
-          <w:lang w:eastAsia="en-ID"/>
-          <w14:ligatures w14:val="none"/>
-        </w:rPr>
-        <w:t>vertikal</w:t>
-      </w:r>
-      <w:proofErr w:type="spellEnd"/>
-      <w:r>
-        <w:rPr>
-          <w:rFonts w:ascii="Times New Roman" w:eastAsia="Times New Roman" w:hAnsi="Times New Roman" w:cs="Times New Roman"/>
-          <w:kern w:val="0"/>
-          <w:sz w:val="28"/>
-          <w:szCs w:val="28"/>
-          <w:lang w:eastAsia="en-ID"/>
-          <w14:ligatures w14:val="none"/>
-        </w:rPr>
-        <w:t xml:space="preserve">, </w:t>
-      </w:r>
-      <w:proofErr w:type="spellStart"/>
-      <w:r>
-        <w:rPr>
-          <w:rFonts w:ascii="Times New Roman" w:eastAsia="Times New Roman" w:hAnsi="Times New Roman" w:cs="Times New Roman"/>
-          <w:kern w:val="0"/>
-          <w:sz w:val="28"/>
-          <w:szCs w:val="28"/>
-          <w:lang w:eastAsia="en-ID"/>
-          <w14:ligatures w14:val="none"/>
-        </w:rPr>
-        <w:t>posisi</w:t>
-      </w:r>
-      <w:proofErr w:type="spellEnd"/>
-      <w:r>
-        <w:rPr>
-          <w:rFonts w:ascii="Times New Roman" w:eastAsia="Times New Roman" w:hAnsi="Times New Roman" w:cs="Times New Roman"/>
-          <w:kern w:val="0"/>
-          <w:sz w:val="28"/>
-          <w:szCs w:val="28"/>
-          <w:lang w:eastAsia="en-ID"/>
-          <w14:ligatures w14:val="none"/>
-        </w:rPr>
-        <w:t xml:space="preserve"> </w:t>
-      </w:r>
-      <w:r>
-        <w:rPr>
-          <w:rFonts w:ascii="Arial" w:eastAsia="Times New Roman" w:hAnsi="Arial" w:cs="Arial"/>
-          <w:kern w:val="0"/>
-          <w:sz w:val="28"/>
-          <w:szCs w:val="28"/>
-          <w:lang w:eastAsia="en-ID"/>
-          <w14:ligatures w14:val="none"/>
-        </w:rPr>
-        <w:t>x</w:t>
-      </w:r>
-      <w:r>
-        <w:rPr>
-          <w:rFonts w:ascii="Arial" w:eastAsia="Times New Roman" w:hAnsi="Arial" w:cs="Arial"/>
-          <w:kern w:val="0"/>
-          <w:sz w:val="28"/>
-          <w:szCs w:val="28"/>
-          <w:lang w:eastAsia="en-ID"/>
-          <w14:ligatures w14:val="none"/>
-        </w:rPr>
-        <w:t xml:space="preserve"> </w:t>
-      </w:r>
-      <w:proofErr w:type="spellStart"/>
-      <w:r>
-        <w:rPr>
-          <w:rFonts w:ascii="Times New Roman" w:eastAsia="Times New Roman" w:hAnsi="Times New Roman" w:cs="Times New Roman"/>
-          <w:kern w:val="0"/>
-          <w:sz w:val="28"/>
-          <w:szCs w:val="28"/>
-          <w:lang w:eastAsia="en-ID"/>
-          <w14:ligatures w14:val="none"/>
-        </w:rPr>
-        <w:t>dari</w:t>
-      </w:r>
-      <w:proofErr w:type="spellEnd"/>
-      <w:r>
-        <w:rPr>
-          <w:rFonts w:ascii="Times New Roman" w:eastAsia="Times New Roman" w:hAnsi="Times New Roman" w:cs="Times New Roman"/>
-          <w:kern w:val="0"/>
-          <w:sz w:val="28"/>
-          <w:szCs w:val="28"/>
-          <w:lang w:eastAsia="en-ID"/>
-          <w14:ligatures w14:val="none"/>
-        </w:rPr>
-        <w:t xml:space="preserve"> </w:t>
-      </w:r>
-      <w:proofErr w:type="spellStart"/>
-      <w:r>
-        <w:rPr>
-          <w:rFonts w:ascii="Times New Roman" w:eastAsia="Times New Roman" w:hAnsi="Times New Roman" w:cs="Times New Roman"/>
-          <w:kern w:val="0"/>
-          <w:sz w:val="28"/>
-          <w:szCs w:val="28"/>
-          <w:lang w:eastAsia="en-ID"/>
-          <w14:ligatures w14:val="none"/>
-        </w:rPr>
-        <w:t>setiap</w:t>
-      </w:r>
-      <w:proofErr w:type="spellEnd"/>
-      <w:r>
-        <w:rPr>
-          <w:rFonts w:ascii="Times New Roman" w:eastAsia="Times New Roman" w:hAnsi="Times New Roman" w:cs="Times New Roman"/>
-          <w:kern w:val="0"/>
-          <w:sz w:val="28"/>
-          <w:szCs w:val="28"/>
-          <w:lang w:eastAsia="en-ID"/>
-          <w14:ligatures w14:val="none"/>
-        </w:rPr>
-        <w:t xml:space="preserve"> </w:t>
-      </w:r>
-      <w:proofErr w:type="spellStart"/>
-      <w:r>
-        <w:rPr>
-          <w:rFonts w:ascii="Times New Roman" w:eastAsia="Times New Roman" w:hAnsi="Times New Roman" w:cs="Times New Roman"/>
-          <w:kern w:val="0"/>
-          <w:sz w:val="28"/>
-          <w:szCs w:val="28"/>
-          <w:lang w:eastAsia="en-ID"/>
-          <w14:ligatures w14:val="none"/>
-        </w:rPr>
-        <w:t>titik</w:t>
-      </w:r>
-      <w:proofErr w:type="spellEnd"/>
-      <w:r>
-        <w:rPr>
-          <w:rFonts w:ascii="Times New Roman" w:eastAsia="Times New Roman" w:hAnsi="Times New Roman" w:cs="Times New Roman"/>
-          <w:kern w:val="0"/>
-          <w:sz w:val="28"/>
-          <w:szCs w:val="28"/>
-          <w:lang w:eastAsia="en-ID"/>
-          <w14:ligatures w14:val="none"/>
-        </w:rPr>
-        <w:t xml:space="preserve"> </w:t>
-      </w:r>
-      <w:proofErr w:type="spellStart"/>
-      <w:r>
-        <w:rPr>
-          <w:rFonts w:ascii="Times New Roman" w:eastAsia="Times New Roman" w:hAnsi="Times New Roman" w:cs="Times New Roman"/>
-          <w:kern w:val="0"/>
-          <w:sz w:val="28"/>
-          <w:szCs w:val="28"/>
-          <w:lang w:eastAsia="en-ID"/>
-          <w14:ligatures w14:val="none"/>
-        </w:rPr>
-        <w:t>tetap</w:t>
-      </w:r>
-      <w:proofErr w:type="spellEnd"/>
-      <w:r>
-        <w:rPr>
-          <w:rFonts w:ascii="Times New Roman" w:eastAsia="Times New Roman" w:hAnsi="Times New Roman" w:cs="Times New Roman"/>
-          <w:kern w:val="0"/>
-          <w:sz w:val="28"/>
-          <w:szCs w:val="28"/>
-          <w:lang w:eastAsia="en-ID"/>
-          <w14:ligatures w14:val="none"/>
-        </w:rPr>
-        <w:t xml:space="preserve"> </w:t>
-      </w:r>
-      <w:proofErr w:type="spellStart"/>
-      <w:r>
-        <w:rPr>
-          <w:rFonts w:ascii="Times New Roman" w:eastAsia="Times New Roman" w:hAnsi="Times New Roman" w:cs="Times New Roman"/>
-          <w:kern w:val="0"/>
-          <w:sz w:val="28"/>
-          <w:szCs w:val="28"/>
-          <w:lang w:eastAsia="en-ID"/>
-          <w14:ligatures w14:val="none"/>
-        </w:rPr>
-        <w:t>konstan</w:t>
-      </w:r>
-      <w:proofErr w:type="spellEnd"/>
-      <w:r>
-        <w:rPr>
-          <w:rFonts w:ascii="Times New Roman" w:eastAsia="Times New Roman" w:hAnsi="Times New Roman" w:cs="Times New Roman"/>
-          <w:kern w:val="0"/>
-          <w:sz w:val="28"/>
-          <w:szCs w:val="28"/>
-          <w:lang w:eastAsia="en-ID"/>
-          <w14:ligatures w14:val="none"/>
-        </w:rPr>
-        <w:t xml:space="preserve">, </w:t>
-      </w:r>
-      <w:proofErr w:type="spellStart"/>
-      <w:r>
-        <w:rPr>
-          <w:rFonts w:ascii="Times New Roman" w:eastAsia="Times New Roman" w:hAnsi="Times New Roman" w:cs="Times New Roman"/>
-          <w:kern w:val="0"/>
-          <w:sz w:val="28"/>
-          <w:szCs w:val="28"/>
-          <w:lang w:eastAsia="en-ID"/>
-          <w14:ligatures w14:val="none"/>
-        </w:rPr>
-        <w:t>sementara</w:t>
-      </w:r>
-      <w:proofErr w:type="spellEnd"/>
-      <w:r>
-        <w:rPr>
-          <w:rFonts w:ascii="Times New Roman" w:eastAsia="Times New Roman" w:hAnsi="Times New Roman" w:cs="Times New Roman"/>
-          <w:kern w:val="0"/>
-          <w:sz w:val="28"/>
-          <w:szCs w:val="28"/>
-          <w:lang w:eastAsia="en-ID"/>
-          <w14:ligatures w14:val="none"/>
-        </w:rPr>
-        <w:t xml:space="preserve"> </w:t>
-      </w:r>
-      <w:proofErr w:type="spellStart"/>
-      <w:r>
-        <w:rPr>
-          <w:rFonts w:ascii="Times New Roman" w:eastAsia="Times New Roman" w:hAnsi="Times New Roman" w:cs="Times New Roman"/>
-          <w:kern w:val="0"/>
-          <w:sz w:val="28"/>
-          <w:szCs w:val="28"/>
-          <w:lang w:eastAsia="en-ID"/>
-          <w14:ligatures w14:val="none"/>
-        </w:rPr>
-        <w:t>posisi</w:t>
-      </w:r>
-      <w:proofErr w:type="spellEnd"/>
-      <w:r>
-        <w:rPr>
-          <w:rFonts w:ascii="Times New Roman" w:eastAsia="Times New Roman" w:hAnsi="Times New Roman" w:cs="Times New Roman"/>
-          <w:kern w:val="0"/>
-          <w:sz w:val="28"/>
-          <w:szCs w:val="28"/>
-          <w:lang w:eastAsia="en-ID"/>
-          <w14:ligatures w14:val="none"/>
-        </w:rPr>
-        <w:t xml:space="preserve"> </w:t>
-      </w:r>
-      <w:r>
-        <w:rPr>
-          <w:rFonts w:ascii="Arial" w:eastAsia="Times New Roman" w:hAnsi="Arial" w:cs="Arial"/>
-          <w:kern w:val="0"/>
-          <w:sz w:val="28"/>
-          <w:szCs w:val="28"/>
-          <w:lang w:eastAsia="en-ID"/>
-          <w14:ligatures w14:val="none"/>
-        </w:rPr>
-        <w:t>y</w:t>
-      </w:r>
-      <w:r>
-        <w:rPr>
-          <w:rFonts w:ascii="Arial" w:eastAsia="Times New Roman" w:hAnsi="Arial" w:cs="Arial"/>
-          <w:kern w:val="0"/>
-          <w:sz w:val="28"/>
-          <w:szCs w:val="28"/>
-          <w:lang w:eastAsia="en-ID"/>
-          <w14:ligatures w14:val="none"/>
-        </w:rPr>
-        <w:t xml:space="preserve"> </w:t>
-      </w:r>
-      <w:proofErr w:type="spellStart"/>
-      <w:r>
-        <w:rPr>
-          <w:rFonts w:ascii="Times New Roman" w:eastAsia="Times New Roman" w:hAnsi="Times New Roman" w:cs="Times New Roman"/>
-          <w:kern w:val="0"/>
-          <w:sz w:val="28"/>
-          <w:szCs w:val="28"/>
-          <w:lang w:eastAsia="en-ID"/>
-          <w14:ligatures w14:val="none"/>
-        </w:rPr>
-        <w:t>digeser</w:t>
-      </w:r>
-      <w:proofErr w:type="spellEnd"/>
-      <w:r>
-        <w:rPr>
-          <w:rFonts w:ascii="Times New Roman" w:eastAsia="Times New Roman" w:hAnsi="Times New Roman" w:cs="Times New Roman"/>
-          <w:kern w:val="0"/>
-          <w:sz w:val="28"/>
-          <w:szCs w:val="28"/>
-          <w:lang w:eastAsia="en-ID"/>
-          <w14:ligatures w14:val="none"/>
-        </w:rPr>
-        <w:t xml:space="preserve"> </w:t>
-      </w:r>
-      <w:proofErr w:type="spellStart"/>
-      <w:r>
-        <w:rPr>
-          <w:rFonts w:ascii="Times New Roman" w:eastAsia="Times New Roman" w:hAnsi="Times New Roman" w:cs="Times New Roman"/>
-          <w:kern w:val="0"/>
-          <w:sz w:val="28"/>
-          <w:szCs w:val="28"/>
-          <w:lang w:eastAsia="en-ID"/>
-          <w14:ligatures w14:val="none"/>
-        </w:rPr>
-        <w:t>sejauh</w:t>
-      </w:r>
-      <w:proofErr w:type="spellEnd"/>
-      <w:r>
-        <w:rPr>
-          <w:rFonts w:ascii="Times New Roman" w:eastAsia="Times New Roman" w:hAnsi="Times New Roman" w:cs="Times New Roman"/>
-          <w:kern w:val="0"/>
-          <w:sz w:val="28"/>
-          <w:szCs w:val="28"/>
-          <w:lang w:eastAsia="en-ID"/>
-          <w14:ligatures w14:val="none"/>
-        </w:rPr>
-        <w:t xml:space="preserve"> </w:t>
-      </w:r>
-      <w:proofErr w:type="spellStart"/>
-      <w:r>
-        <w:rPr>
-          <w:rFonts w:ascii="Times New Roman" w:eastAsia="Times New Roman" w:hAnsi="Times New Roman" w:cs="Times New Roman"/>
-          <w:kern w:val="0"/>
-          <w:sz w:val="28"/>
-          <w:szCs w:val="28"/>
-          <w:lang w:eastAsia="en-ID"/>
-          <w14:ligatures w14:val="none"/>
-        </w:rPr>
-        <w:t>nilai</w:t>
-      </w:r>
-      <w:proofErr w:type="spellEnd"/>
-      <w:r>
-        <w:rPr>
-          <w:rFonts w:ascii="Times New Roman" w:eastAsia="Times New Roman" w:hAnsi="Times New Roman" w:cs="Times New Roman"/>
-          <w:kern w:val="0"/>
-          <w:sz w:val="28"/>
-          <w:szCs w:val="28"/>
-          <w:lang w:eastAsia="en-ID"/>
-          <w14:ligatures w14:val="none"/>
-        </w:rPr>
-        <w:t xml:space="preserve"> yang </w:t>
-      </w:r>
-      <w:proofErr w:type="spellStart"/>
-      <w:r>
-        <w:rPr>
-          <w:rFonts w:ascii="Times New Roman" w:eastAsia="Times New Roman" w:hAnsi="Times New Roman" w:cs="Times New Roman"/>
-          <w:kern w:val="0"/>
-          <w:sz w:val="28"/>
-          <w:szCs w:val="28"/>
-          <w:lang w:eastAsia="en-ID"/>
-          <w14:ligatures w14:val="none"/>
-        </w:rPr>
-        <w:t>proporsional</w:t>
-      </w:r>
-      <w:proofErr w:type="spellEnd"/>
-      <w:r>
-        <w:rPr>
-          <w:rFonts w:ascii="Times New Roman" w:eastAsia="Times New Roman" w:hAnsi="Times New Roman" w:cs="Times New Roman"/>
-          <w:kern w:val="0"/>
-          <w:sz w:val="28"/>
-          <w:szCs w:val="28"/>
-          <w:lang w:eastAsia="en-ID"/>
-          <w14:ligatures w14:val="none"/>
-        </w:rPr>
-        <w:t xml:space="preserve"> </w:t>
-      </w:r>
-      <w:proofErr w:type="spellStart"/>
-      <w:r>
-        <w:rPr>
-          <w:rFonts w:ascii="Times New Roman" w:eastAsia="Times New Roman" w:hAnsi="Times New Roman" w:cs="Times New Roman"/>
-          <w:kern w:val="0"/>
-          <w:sz w:val="28"/>
-          <w:szCs w:val="28"/>
-          <w:lang w:eastAsia="en-ID"/>
-          <w14:ligatures w14:val="none"/>
-        </w:rPr>
-        <w:t>dengan</w:t>
-      </w:r>
-      <w:proofErr w:type="spellEnd"/>
-      <w:r>
-        <w:rPr>
-          <w:rFonts w:ascii="Times New Roman" w:eastAsia="Times New Roman" w:hAnsi="Times New Roman" w:cs="Times New Roman"/>
-          <w:kern w:val="0"/>
-          <w:sz w:val="28"/>
-          <w:szCs w:val="28"/>
-          <w:lang w:eastAsia="en-ID"/>
-          <w14:ligatures w14:val="none"/>
-        </w:rPr>
-        <w:t xml:space="preserve"> </w:t>
-      </w:r>
-      <w:proofErr w:type="spellStart"/>
-      <w:r>
-        <w:rPr>
-          <w:rFonts w:ascii="Times New Roman" w:eastAsia="Times New Roman" w:hAnsi="Times New Roman" w:cs="Times New Roman"/>
-          <w:kern w:val="0"/>
-          <w:sz w:val="28"/>
-          <w:szCs w:val="28"/>
-          <w:lang w:eastAsia="en-ID"/>
-          <w14:ligatures w14:val="none"/>
-        </w:rPr>
-        <w:t>nilai</w:t>
-      </w:r>
-      <w:proofErr w:type="spellEnd"/>
-      <w:r>
-        <w:rPr>
-          <w:rFonts w:ascii="Times New Roman" w:eastAsia="Times New Roman" w:hAnsi="Times New Roman" w:cs="Times New Roman"/>
-          <w:kern w:val="0"/>
-          <w:sz w:val="28"/>
-          <w:szCs w:val="28"/>
-          <w:lang w:eastAsia="en-ID"/>
-          <w14:ligatures w14:val="none"/>
-        </w:rPr>
-        <w:t xml:space="preserve"> </w:t>
-      </w:r>
-      <w:r>
-        <w:rPr>
-          <w:rFonts w:ascii="Arial" w:eastAsia="Times New Roman" w:hAnsi="Arial" w:cs="Arial"/>
-          <w:kern w:val="0"/>
-          <w:sz w:val="28"/>
-          <w:szCs w:val="28"/>
-          <w:lang w:eastAsia="en-ID"/>
-          <w14:ligatures w14:val="none"/>
-        </w:rPr>
-        <w:t>x</w:t>
-      </w:r>
-      <w:r>
-        <w:rPr>
-          <w:rFonts w:ascii="Times New Roman" w:eastAsia="Times New Roman" w:hAnsi="Times New Roman" w:cs="Times New Roman"/>
-          <w:kern w:val="0"/>
-          <w:sz w:val="28"/>
-          <w:szCs w:val="28"/>
-          <w:lang w:eastAsia="en-ID"/>
-          <w14:ligatures w14:val="none"/>
-        </w:rPr>
-        <w:t>-</w:t>
-      </w:r>
-      <w:proofErr w:type="spellStart"/>
-      <w:r>
-        <w:rPr>
-          <w:rFonts w:ascii="Times New Roman" w:eastAsia="Times New Roman" w:hAnsi="Times New Roman" w:cs="Times New Roman"/>
-          <w:kern w:val="0"/>
-          <w:sz w:val="28"/>
-          <w:szCs w:val="28"/>
-          <w:lang w:eastAsia="en-ID"/>
-          <w14:ligatures w14:val="none"/>
-        </w:rPr>
-        <w:t>nya</w:t>
-      </w:r>
-      <w:proofErr w:type="spellEnd"/>
-      <w:r>
-        <w:rPr>
-          <w:rFonts w:ascii="Times New Roman" w:eastAsia="Times New Roman" w:hAnsi="Times New Roman" w:cs="Times New Roman"/>
-          <w:kern w:val="0"/>
-          <w:sz w:val="28"/>
-          <w:szCs w:val="28"/>
-          <w:lang w:eastAsia="en-ID"/>
-          <w14:ligatures w14:val="none"/>
-        </w:rPr>
-        <w:t>.</w:t>
-      </w:r>
-    </w:p>
-    <w:p>
-      <w:pPr>
-        <w:pStyle w:val="ListParagraph"/>
-        <w:ind w:left="1440"/>
-      </w:pPr>
-      <w:proofErr w:type="spellStart"/>
-      <w:r>
-        <w:rPr>
-          <w:b/>
-          <w:bCs/>
-        </w:rPr>
-        <w:t>Efek</w:t>
-      </w:r>
-      <w:proofErr w:type="spellEnd"/>
-      <w:r>
-        <w:rPr>
-          <w:b/>
-          <w:bCs/>
-        </w:rPr>
-        <w:t>:</w:t>
-      </w:r>
-      <w:r>
-        <w:t xml:space="preserve"> </w:t>
-      </w:r>
-      <w:proofErr w:type="spellStart"/>
-      <w:r>
-        <w:t>Objek</w:t>
-      </w:r>
-      <w:proofErr w:type="spellEnd"/>
-      <w:r>
-        <w:t xml:space="preserve"> </w:t>
-      </w:r>
-      <w:proofErr w:type="spellStart"/>
-      <w:r>
-        <w:t>tampak</w:t>
-      </w:r>
-      <w:proofErr w:type="spellEnd"/>
-      <w:r>
-        <w:t xml:space="preserve"> "miring" </w:t>
-      </w:r>
-      <w:proofErr w:type="spellStart"/>
-      <w:r>
-        <w:t>ke</w:t>
-      </w:r>
-      <w:proofErr w:type="spellEnd"/>
-      <w:r>
-        <w:t xml:space="preserve"> </w:t>
-      </w:r>
-      <w:proofErr w:type="spellStart"/>
-      <w:r>
-        <w:t>arah</w:t>
-      </w:r>
-      <w:proofErr w:type="spellEnd"/>
-      <w:r>
-        <w:t xml:space="preserve"> </w:t>
-      </w:r>
-      <w:proofErr w:type="spellStart"/>
-      <w:r>
-        <w:t>atas</w:t>
-      </w:r>
-      <w:proofErr w:type="spellEnd"/>
-      <w:r>
-        <w:t xml:space="preserve"> </w:t>
-      </w:r>
-      <w:proofErr w:type="spellStart"/>
-      <w:r>
-        <w:t>atau</w:t>
-      </w:r>
-      <w:proofErr w:type="spellEnd"/>
-      <w:r>
-        <w:t xml:space="preserve"> </w:t>
-      </w:r>
-      <w:proofErr w:type="spellStart"/>
-      <w:r>
-        <w:t>bawah</w:t>
-      </w:r>
-      <w:proofErr w:type="spellEnd"/>
-      <w:r>
-        <w:t xml:space="preserve">. Garis-garis </w:t>
-      </w:r>
-      <w:proofErr w:type="spellStart"/>
-      <w:r>
-        <w:t>vertikal</w:t>
-      </w:r>
-      <w:proofErr w:type="spellEnd"/>
-      <w:r>
-        <w:t xml:space="preserve"> pada </w:t>
-      </w:r>
-      <w:proofErr w:type="spellStart"/>
-      <w:r>
-        <w:t>objek</w:t>
-      </w:r>
-      <w:proofErr w:type="spellEnd"/>
-      <w:r>
-        <w:t xml:space="preserve"> </w:t>
-      </w:r>
-      <w:proofErr w:type="spellStart"/>
-      <w:r>
-        <w:t>akan</w:t>
-      </w:r>
-      <w:proofErr w:type="spellEnd"/>
-      <w:r>
-        <w:t xml:space="preserve"> </w:t>
-      </w:r>
-      <w:proofErr w:type="spellStart"/>
-      <w:r>
-        <w:t>tetap</w:t>
-      </w:r>
-      <w:proofErr w:type="spellEnd"/>
-      <w:r>
-        <w:t xml:space="preserve"> </w:t>
-      </w:r>
-      <w:proofErr w:type="spellStart"/>
-      <w:r>
-        <w:t>vertikal</w:t>
-      </w:r>
-      <w:proofErr w:type="spellEnd"/>
-      <w:r>
-        <w:t xml:space="preserve">, </w:t>
-      </w:r>
-      <w:proofErr w:type="spellStart"/>
-      <w:r>
-        <w:t>tetapi</w:t>
-      </w:r>
-      <w:proofErr w:type="spellEnd"/>
-      <w:r>
-        <w:t xml:space="preserve"> garis-garis horizontal </w:t>
-      </w:r>
-      <w:proofErr w:type="spellStart"/>
-      <w:r>
-        <w:t>akan</w:t>
-      </w:r>
-      <w:proofErr w:type="spellEnd"/>
-      <w:r>
-        <w:t xml:space="preserve"> </w:t>
-      </w:r>
-      <w:proofErr w:type="spellStart"/>
-      <w:r>
-        <w:t>menjadi</w:t>
-      </w:r>
-      <w:proofErr w:type="spellEnd"/>
-      <w:r>
-        <w:t xml:space="preserve"> miring.</w:t>
-      </w:r>
-    </w:p>
-    <w:p>
-      <w:pPr>
-        <w:pStyle w:val="ListParagraph"/>
-        <w:ind w:left="1440"/>
-      </w:pPr>
-    </w:p>
-    <w:p>
-      <w:pPr>
-        <w:pStyle w:val="ListParagraph"/>
-        <w:ind w:left="1440"/>
-        <w:rPr>
-          <w:sz w:val="20"/>
-          <w:szCs w:val="20"/>
-        </w:rPr>
-      </w:pPr>
-    </w:p>
-    <w:p>
-      <w:pPr>
-        <w:pStyle w:val="ListParagraph"/>
-        <w:ind w:left="1440"/>
-        <w:rPr>
-          <w:sz w:val="20"/>
-          <w:szCs w:val="20"/>
-        </w:rPr>
-      </w:pPr>
-    </w:p>
-    <w:p>
-      <w:pPr>
-        <w:pStyle w:val="ListParagraph"/>
-        <w:ind w:left="1440"/>
-        <w:rPr>
-          <w:sz w:val="20"/>
-          <w:szCs w:val="20"/>
-        </w:rPr>
-      </w:pPr>
-    </w:p>
-    <w:p>
-      <w:pPr>
-        <w:pStyle w:val="ListParagraph"/>
-        <w:ind w:left="1440"/>
-        <w:rPr>
-          <w:sz w:val="20"/>
-          <w:szCs w:val="20"/>
-        </w:rPr>
-      </w:pPr>
-    </w:p>
-    <w:p>
-      <w:pPr>
-        <w:pStyle w:val="ListParagraph"/>
-        <w:ind w:left="1440"/>
-        <w:rPr>
-          <w:sz w:val="20"/>
-          <w:szCs w:val="20"/>
-        </w:rPr>
-      </w:pPr>
-    </w:p>
-    <w:p>
-      <w:pPr>
-        <w:pStyle w:val="ListParagraph"/>
-        <w:ind w:left="1440"/>
-        <w:rPr>
-          <w:sz w:val="20"/>
-          <w:szCs w:val="20"/>
-        </w:rPr>
-      </w:pPr>
-    </w:p>
-    <w:p>
-      <w:pPr>
-        <w:pStyle w:val="ListParagraph"/>
-        <w:ind w:left="1440"/>
-        <w:rPr>
-          <w:sz w:val="20"/>
-          <w:szCs w:val="20"/>
-        </w:rPr>
-      </w:pPr>
-    </w:p>
-    <w:p>
-      <w:pPr>
-        <w:pStyle w:val="ListParagraph"/>
-        <w:ind w:left="1440"/>
-        <w:rPr>
-          <w:sz w:val="20"/>
-          <w:szCs w:val="20"/>
-        </w:rPr>
-      </w:pPr>
-    </w:p>
-    <w:p>
-      <w:pPr>
-        <w:pStyle w:val="ListParagraph"/>
-        <w:ind w:left="1440"/>
-        <w:rPr>
-          <w:sz w:val="20"/>
-          <w:szCs w:val="20"/>
-        </w:rPr>
-      </w:pPr>
-    </w:p>
-    <w:p>
-      <w:pPr>
-        <w:pStyle w:val="ListParagraph"/>
-        <w:ind w:left="1440"/>
-        <w:rPr>
-          <w:sz w:val="20"/>
-          <w:szCs w:val="20"/>
-        </w:rPr>
-      </w:pPr>
-    </w:p>
-    <w:p>
-      <w:pPr>
-        <w:pStyle w:val="ListParagraph"/>
-        <w:ind w:left="1440"/>
-        <w:rPr>
-          <w:sz w:val="20"/>
-          <w:szCs w:val="20"/>
-        </w:rPr>
-      </w:pPr>
-    </w:p>
-    <w:p>
-      <w:pPr>
-        <w:pStyle w:val="ListParagraph"/>
-        <w:ind w:left="1440"/>
-        <w:rPr>
-          <w:sz w:val="20"/>
-          <w:szCs w:val="20"/>
-        </w:rPr>
-      </w:pPr>
-    </w:p>
-    <w:p>
-      <w:pPr>
-        <w:pStyle w:val="ListParagraph"/>
-        <w:ind w:left="1440"/>
-        <w:rPr>
-          <w:sz w:val="20"/>
-          <w:szCs w:val="20"/>
-        </w:rPr>
-      </w:pPr>
-    </w:p>
-    <w:p>
-      <w:pPr>
-        <w:pStyle w:val="ListParagraph"/>
-        <w:ind w:left="1440"/>
-        <w:rPr>
-          <w:sz w:val="20"/>
-          <w:szCs w:val="20"/>
-        </w:rPr>
-      </w:pPr>
-    </w:p>
-    <w:p>
-      <w:pPr>
-        <w:pStyle w:val="ListParagraph"/>
-        <w:ind w:left="1440"/>
-        <w:rPr>
-          <w:sz w:val="20"/>
-          <w:szCs w:val="20"/>
-        </w:rPr>
-      </w:pPr>
-    </w:p>
-    <w:p>
-      <w:pPr>
-        <w:pStyle w:val="ListParagraph"/>
-        <w:ind w:left="1440"/>
-        <w:rPr>
-          <w:sz w:val="20"/>
-          <w:szCs w:val="20"/>
-        </w:rPr>
-      </w:pPr>
-    </w:p>
-    <w:p>
-      <w:pPr>
-        <w:pStyle w:val="ListParagraph"/>
-        <w:ind w:left="1440"/>
-        <w:rPr>
-          <w:sz w:val="20"/>
-          <w:szCs w:val="20"/>
-        </w:rPr>
-      </w:pPr>
-    </w:p>
-    <w:p>
-      <w:pPr>
-        <w:pStyle w:val="ListParagraph"/>
-        <w:ind w:left="1440"/>
-        <w:rPr>
-          <w:sz w:val="20"/>
-          <w:szCs w:val="20"/>
-        </w:rPr>
-      </w:pPr>
-    </w:p>
-    <w:p>
-      <w:pPr>
-        <w:pStyle w:val="ListParagraph"/>
-        <w:ind w:left="1440"/>
-        <w:rPr>
-          <w:sz w:val="20"/>
-          <w:szCs w:val="20"/>
-        </w:rPr>
-      </w:pPr>
-    </w:p>
-    <w:p>
-      <w:pPr>
-        <w:pStyle w:val="ListParagraph"/>
-        <w:ind w:left="1440"/>
-        <w:rPr>
-          <w:sz w:val="20"/>
-          <w:szCs w:val="20"/>
-        </w:rPr>
-      </w:pPr>
-    </w:p>
-    <w:p>
-      <w:pPr>
-        <w:pStyle w:val="ListParagraph"/>
-        <w:ind w:left="1440"/>
-        <w:rPr>
-          <w:sz w:val="20"/>
-          <w:szCs w:val="20"/>
-        </w:rPr>
-      </w:pPr>
-    </w:p>
-    <w:p>
-      <w:pPr>
-        <w:pStyle w:val="ListParagraph"/>
-        <w:ind w:left="1440"/>
-        <w:rPr>
-          <w:sz w:val="20"/>
-          <w:szCs w:val="20"/>
-        </w:rPr>
-      </w:pPr>
-    </w:p>
-    <w:p>
-      <w:pPr>
-        <w:pStyle w:val="ListParagraph"/>
-        <w:ind w:left="1440"/>
-        <w:rPr>
-          <w:sz w:val="20"/>
-          <w:szCs w:val="20"/>
-        </w:rPr>
-      </w:pPr>
-    </w:p>
-    <w:p>
-      <w:pPr>
-        <w:pStyle w:val="ListParagraph"/>
-        <w:ind w:left="1440"/>
-        <w:rPr>
-          <w:sz w:val="20"/>
-          <w:szCs w:val="20"/>
-        </w:rPr>
-      </w:pPr>
-    </w:p>
-    <w:p>
-      <w:pPr>
-        <w:pStyle w:val="ListParagraph"/>
-        <w:ind w:left="1440"/>
-        <w:rPr>
-          <w:sz w:val="20"/>
-          <w:szCs w:val="20"/>
-        </w:rPr>
-      </w:pPr>
-    </w:p>
-    <w:p>
-      <w:pPr>
         <w:pStyle w:val="ListParagraph"/>
         <w:spacing w:after="0" w:line="240" w:lineRule="auto"/>
         <w:ind w:left="0"/>
@@ -2414,7 +464,19 @@
           <w:szCs w:val="24"/>
         </w:rPr>
       </w:pPr>
-      <w:proofErr w:type="spellStart"/>
+    </w:p>
+    <w:p>
+      <w:pPr>
+        <w:pStyle w:val="ListParagraph"/>
+        <w:spacing w:after="0" w:line="240" w:lineRule="auto"/>
+        <w:ind w:left="0"/>
+        <w:rPr>
+          <w:b/>
+          <w:bCs/>
+          <w:sz w:val="24"/>
+          <w:szCs w:val="24"/>
+        </w:rPr>
+      </w:pPr>
       <w:r>
         <w:rPr>
           <w:b/>
@@ -2423,9 +485,8 @@
           <w:szCs w:val="24"/>
         </w:rPr>
         <w:lastRenderedPageBreak/>
-        <w:t>Praktikum</w:t>
+        <w:t>Praktikum :</w:t>
       </w:r>
-      <w:proofErr w:type="spellEnd"/>
       <w:r>
         <w:rPr>
           <w:b/>
@@ -2433,7 +494,472 @@
           <w:sz w:val="24"/>
           <w:szCs w:val="24"/>
         </w:rPr>
-        <w:t xml:space="preserve"> :</w:t>
+        <w:t xml:space="preserve"> </w:t>
+      </w:r>
+      <w:hyperlink r:id="rId6" w:history="1">
+        <w:r>
+          <w:rPr>
+            <w:rStyle w:val="Hyperlink"/>
+            <w:b/>
+            <w:bCs/>
+            <w:sz w:val="24"/>
+            <w:szCs w:val="24"/>
+          </w:rPr>
+          <w:t>https://github.com/adi026-ar/phyton/blob/main/code/modul%209/praktikum.ipynb</w:t>
+        </w:r>
+      </w:hyperlink>
+      <w:r>
+        <w:rPr>
+          <w:b/>
+          <w:bCs/>
+          <w:sz w:val="24"/>
+          <w:szCs w:val="24"/>
+        </w:rPr>
+        <w:t xml:space="preserve"> </w:t>
+      </w:r>
+    </w:p>
+    <w:p>
+      <w:pPr>
+        <w:pStyle w:val="ListParagraph"/>
+        <w:spacing w:after="0" w:line="240" w:lineRule="auto"/>
+        <w:ind w:left="0"/>
+        <w:rPr>
+          <w:sz w:val="24"/>
+          <w:szCs w:val="24"/>
+        </w:rPr>
+      </w:pPr>
+      <w:r>
+        <w:rPr>
+          <w:sz w:val="24"/>
+          <w:szCs w:val="24"/>
+        </w:rPr>
+        <w:drawing>
+          <wp:inline distT="0" distB="0" distL="0" distR="0" wp14:anchorId="5900952B" wp14:editId="7F143214">
+            <wp:extent cx="2513075" cy="2628900"/>
+            <wp:effectExtent l="0" t="0" r="1905" b="0"/>
+            <wp:docPr id="1791609728" name="Picture 1"/>
+            <wp:cNvGraphicFramePr>
+              <a:graphicFrameLocks xmlns:a="http://schemas.openxmlformats.org/drawingml/2006/main" noChangeAspect="1"/>
+            </wp:cNvGraphicFramePr>
+            <a:graphic xmlns:a="http://schemas.openxmlformats.org/drawingml/2006/main">
+              <a:graphicData uri="http://schemas.openxmlformats.org/drawingml/2006/picture">
+                <pic:pic xmlns:pic="http://schemas.openxmlformats.org/drawingml/2006/picture">
+                  <pic:nvPicPr>
+                    <pic:cNvPr id="1791609728" name=""/>
+                    <pic:cNvPicPr/>
+                  </pic:nvPicPr>
+                  <pic:blipFill>
+                    <a:blip r:embed="rId7"/>
+                    <a:stretch>
+                      <a:fillRect/>
+                    </a:stretch>
+                  </pic:blipFill>
+                  <pic:spPr>
+                    <a:xfrm>
+                      <a:off x="0" y="0"/>
+                      <a:ext cx="2517141" cy="2633153"/>
+                    </a:xfrm>
+                    <a:prstGeom prst="rect">
+                      <a:avLst/>
+                    </a:prstGeom>
+                  </pic:spPr>
+                </pic:pic>
+              </a:graphicData>
+            </a:graphic>
+          </wp:inline>
+        </w:drawing>
+      </w:r>
+      <w:r>
+        <w:rPr>
+          <w:sz w:val="24"/>
+          <w:szCs w:val="24"/>
+        </w:rPr>
+        <w:drawing>
+          <wp:inline distT="0" distB="0" distL="0" distR="0" wp14:anchorId="0964AEE0" wp14:editId="1BE6DE57">
+            <wp:extent cx="2377440" cy="2586852"/>
+            <wp:effectExtent l="0" t="0" r="3810" b="4445"/>
+            <wp:docPr id="363793381" name="Picture 1"/>
+            <wp:cNvGraphicFramePr>
+              <a:graphicFrameLocks xmlns:a="http://schemas.openxmlformats.org/drawingml/2006/main" noChangeAspect="1"/>
+            </wp:cNvGraphicFramePr>
+            <a:graphic xmlns:a="http://schemas.openxmlformats.org/drawingml/2006/main">
+              <a:graphicData uri="http://schemas.openxmlformats.org/drawingml/2006/picture">
+                <pic:pic xmlns:pic="http://schemas.openxmlformats.org/drawingml/2006/picture">
+                  <pic:nvPicPr>
+                    <pic:cNvPr id="363793381" name=""/>
+                    <pic:cNvPicPr/>
+                  </pic:nvPicPr>
+                  <pic:blipFill>
+                    <a:blip r:embed="rId8"/>
+                    <a:stretch>
+                      <a:fillRect/>
+                    </a:stretch>
+                  </pic:blipFill>
+                  <pic:spPr>
+                    <a:xfrm>
+                      <a:off x="0" y="0"/>
+                      <a:ext cx="2382612" cy="2592480"/>
+                    </a:xfrm>
+                    <a:prstGeom prst="rect">
+                      <a:avLst/>
+                    </a:prstGeom>
+                  </pic:spPr>
+                </pic:pic>
+              </a:graphicData>
+            </a:graphic>
+          </wp:inline>
+        </w:drawing>
+      </w:r>
+      <w:r>
+        <w:rPr>
+          <w:sz w:val="24"/>
+          <w:szCs w:val="24"/>
+        </w:rPr>
+        <w:drawing>
+          <wp:inline distT="0" distB="0" distL="0" distR="0" wp14:anchorId="293F6C05" wp14:editId="298D4087">
+            <wp:extent cx="3169920" cy="1957412"/>
+            <wp:effectExtent l="0" t="0" r="0" b="5080"/>
+            <wp:docPr id="464018664" name="Picture 1"/>
+            <wp:cNvGraphicFramePr>
+              <a:graphicFrameLocks xmlns:a="http://schemas.openxmlformats.org/drawingml/2006/main" noChangeAspect="1"/>
+            </wp:cNvGraphicFramePr>
+            <a:graphic xmlns:a="http://schemas.openxmlformats.org/drawingml/2006/main">
+              <a:graphicData uri="http://schemas.openxmlformats.org/drawingml/2006/picture">
+                <pic:pic xmlns:pic="http://schemas.openxmlformats.org/drawingml/2006/picture">
+                  <pic:nvPicPr>
+                    <pic:cNvPr id="464018664" name=""/>
+                    <pic:cNvPicPr/>
+                  </pic:nvPicPr>
+                  <pic:blipFill>
+                    <a:blip r:embed="rId9"/>
+                    <a:stretch>
+                      <a:fillRect/>
+                    </a:stretch>
+                  </pic:blipFill>
+                  <pic:spPr>
+                    <a:xfrm>
+                      <a:off x="0" y="0"/>
+                      <a:ext cx="3185050" cy="1966755"/>
+                    </a:xfrm>
+                    <a:prstGeom prst="rect">
+                      <a:avLst/>
+                    </a:prstGeom>
+                  </pic:spPr>
+                </pic:pic>
+              </a:graphicData>
+            </a:graphic>
+          </wp:inline>
+        </w:drawing>
+      </w:r>
+    </w:p>
+    <w:p>
+      <w:pPr>
+        <w:pStyle w:val="ListParagraph"/>
+        <w:spacing w:after="0" w:line="240" w:lineRule="auto"/>
+        <w:ind w:left="0"/>
+        <w:rPr>
+          <w:sz w:val="24"/>
+          <w:szCs w:val="24"/>
+        </w:rPr>
+      </w:pPr>
+    </w:p>
+    <w:p>
+      <w:pPr>
+        <w:pStyle w:val="ListParagraph"/>
+        <w:spacing w:after="0" w:line="240" w:lineRule="auto"/>
+        <w:ind w:left="0"/>
+        <w:rPr>
+          <w:sz w:val="24"/>
+          <w:szCs w:val="24"/>
+        </w:rPr>
+      </w:pPr>
+    </w:p>
+    <w:p>
+      <w:pPr>
+        <w:pStyle w:val="ListParagraph"/>
+        <w:spacing w:after="0" w:line="240" w:lineRule="auto"/>
+        <w:ind w:left="0"/>
+        <w:rPr>
+          <w:sz w:val="24"/>
+          <w:szCs w:val="24"/>
+        </w:rPr>
+      </w:pPr>
+    </w:p>
+    <w:p>
+      <w:pPr>
+        <w:pStyle w:val="ListParagraph"/>
+        <w:spacing w:after="0" w:line="240" w:lineRule="auto"/>
+        <w:ind w:left="0"/>
+        <w:rPr>
+          <w:sz w:val="24"/>
+          <w:szCs w:val="24"/>
+        </w:rPr>
+      </w:pPr>
+    </w:p>
+    <w:p>
+      <w:pPr>
+        <w:pStyle w:val="ListParagraph"/>
+        <w:spacing w:after="0" w:line="240" w:lineRule="auto"/>
+        <w:ind w:left="0"/>
+        <w:rPr>
+          <w:sz w:val="24"/>
+          <w:szCs w:val="24"/>
+        </w:rPr>
+      </w:pPr>
+    </w:p>
+    <w:p>
+      <w:pPr>
+        <w:pStyle w:val="ListParagraph"/>
+        <w:spacing w:after="0" w:line="240" w:lineRule="auto"/>
+        <w:ind w:left="0"/>
+        <w:rPr>
+          <w:sz w:val="24"/>
+          <w:szCs w:val="24"/>
+        </w:rPr>
+      </w:pPr>
+    </w:p>
+    <w:p>
+      <w:pPr>
+        <w:pStyle w:val="ListParagraph"/>
+        <w:spacing w:after="0" w:line="240" w:lineRule="auto"/>
+        <w:ind w:left="0"/>
+        <w:rPr>
+          <w:sz w:val="24"/>
+          <w:szCs w:val="24"/>
+        </w:rPr>
+      </w:pPr>
+    </w:p>
+    <w:p>
+      <w:pPr>
+        <w:pStyle w:val="ListParagraph"/>
+        <w:spacing w:after="0" w:line="240" w:lineRule="auto"/>
+        <w:ind w:left="0"/>
+        <w:rPr>
+          <w:sz w:val="24"/>
+          <w:szCs w:val="24"/>
+        </w:rPr>
+      </w:pPr>
+    </w:p>
+    <w:p>
+      <w:pPr>
+        <w:pStyle w:val="ListParagraph"/>
+        <w:spacing w:after="0" w:line="240" w:lineRule="auto"/>
+        <w:ind w:left="0"/>
+        <w:rPr>
+          <w:sz w:val="24"/>
+          <w:szCs w:val="24"/>
+        </w:rPr>
+      </w:pPr>
+    </w:p>
+    <w:p>
+      <w:pPr>
+        <w:pStyle w:val="ListParagraph"/>
+        <w:spacing w:after="0" w:line="240" w:lineRule="auto"/>
+        <w:ind w:left="0"/>
+        <w:rPr>
+          <w:sz w:val="24"/>
+          <w:szCs w:val="24"/>
+        </w:rPr>
+      </w:pPr>
+    </w:p>
+    <w:p>
+      <w:pPr>
+        <w:pStyle w:val="ListParagraph"/>
+        <w:spacing w:after="0" w:line="240" w:lineRule="auto"/>
+        <w:ind w:left="0"/>
+        <w:rPr>
+          <w:sz w:val="24"/>
+          <w:szCs w:val="24"/>
+        </w:rPr>
+      </w:pPr>
+    </w:p>
+    <w:p>
+      <w:pPr>
+        <w:pStyle w:val="ListParagraph"/>
+        <w:spacing w:after="0" w:line="240" w:lineRule="auto"/>
+        <w:ind w:left="0"/>
+        <w:rPr>
+          <w:sz w:val="24"/>
+          <w:szCs w:val="24"/>
+        </w:rPr>
+      </w:pPr>
+    </w:p>
+    <w:p>
+      <w:pPr>
+        <w:pStyle w:val="ListParagraph"/>
+        <w:spacing w:after="0" w:line="240" w:lineRule="auto"/>
+        <w:ind w:left="0"/>
+        <w:rPr>
+          <w:sz w:val="24"/>
+          <w:szCs w:val="24"/>
+        </w:rPr>
+      </w:pPr>
+    </w:p>
+    <w:p>
+      <w:pPr>
+        <w:pStyle w:val="ListParagraph"/>
+        <w:spacing w:after="0" w:line="240" w:lineRule="auto"/>
+        <w:ind w:left="0"/>
+        <w:rPr>
+          <w:sz w:val="24"/>
+          <w:szCs w:val="24"/>
+        </w:rPr>
+      </w:pPr>
+    </w:p>
+    <w:p>
+      <w:pPr>
+        <w:pStyle w:val="ListParagraph"/>
+        <w:spacing w:after="0" w:line="240" w:lineRule="auto"/>
+        <w:ind w:left="0"/>
+        <w:rPr>
+          <w:sz w:val="24"/>
+          <w:szCs w:val="24"/>
+        </w:rPr>
+      </w:pPr>
+    </w:p>
+    <w:p>
+      <w:pPr>
+        <w:pStyle w:val="ListParagraph"/>
+        <w:spacing w:after="0" w:line="240" w:lineRule="auto"/>
+        <w:ind w:left="0"/>
+        <w:rPr>
+          <w:sz w:val="24"/>
+          <w:szCs w:val="24"/>
+        </w:rPr>
+      </w:pPr>
+    </w:p>
+    <w:p>
+      <w:pPr>
+        <w:pStyle w:val="ListParagraph"/>
+        <w:spacing w:after="0" w:line="240" w:lineRule="auto"/>
+        <w:ind w:left="0"/>
+        <w:rPr>
+          <w:sz w:val="24"/>
+          <w:szCs w:val="24"/>
+        </w:rPr>
+      </w:pPr>
+    </w:p>
+    <w:p>
+      <w:pPr>
+        <w:pStyle w:val="ListParagraph"/>
+        <w:spacing w:after="0" w:line="240" w:lineRule="auto"/>
+        <w:ind w:left="0"/>
+        <w:rPr>
+          <w:sz w:val="24"/>
+          <w:szCs w:val="24"/>
+        </w:rPr>
+      </w:pPr>
+    </w:p>
+    <w:p>
+      <w:pPr>
+        <w:pStyle w:val="ListParagraph"/>
+        <w:spacing w:after="0" w:line="240" w:lineRule="auto"/>
+        <w:ind w:left="0"/>
+        <w:rPr>
+          <w:sz w:val="24"/>
+          <w:szCs w:val="24"/>
+        </w:rPr>
+      </w:pPr>
+    </w:p>
+    <w:p>
+      <w:pPr>
+        <w:pStyle w:val="ListParagraph"/>
+        <w:spacing w:after="0" w:line="240" w:lineRule="auto"/>
+        <w:ind w:left="0"/>
+        <w:rPr>
+          <w:sz w:val="24"/>
+          <w:szCs w:val="24"/>
+        </w:rPr>
+      </w:pPr>
+    </w:p>
+    <w:p>
+      <w:pPr>
+        <w:pStyle w:val="ListParagraph"/>
+        <w:spacing w:after="0" w:line="240" w:lineRule="auto"/>
+        <w:ind w:left="0"/>
+        <w:rPr>
+          <w:sz w:val="24"/>
+          <w:szCs w:val="24"/>
+        </w:rPr>
+      </w:pPr>
+      <w:r>
+        <w:rPr>
+          <w:b/>
+          <w:bCs/>
+          <w:sz w:val="24"/>
+          <w:szCs w:val="24"/>
+        </w:rPr>
+        <w:lastRenderedPageBreak/>
+        <w:t xml:space="preserve">tugas : </w:t>
+      </w:r>
+      <w:hyperlink r:id="rId10" w:history="1">
+        <w:r>
+          <w:rPr>
+            <w:rStyle w:val="Hyperlink"/>
+            <w:sz w:val="24"/>
+            <w:szCs w:val="24"/>
+          </w:rPr>
+          <w:t>https://github.com/adi026-ar/phyton/blob/main/code/modul%209/tugas.ipynb</w:t>
+        </w:r>
+      </w:hyperlink>
+      <w:r>
+        <w:rPr>
+          <w:sz w:val="24"/>
+          <w:szCs w:val="24"/>
+        </w:rPr>
+        <w:t xml:space="preserve"> </w:t>
+      </w:r>
+    </w:p>
+    <w:p>
+      <w:pPr>
+        <w:pStyle w:val="ListParagraph"/>
+        <w:spacing w:after="0" w:line="240" w:lineRule="auto"/>
+        <w:ind w:left="0"/>
+        <w:rPr>
+          <w:sz w:val="24"/>
+          <w:szCs w:val="24"/>
+        </w:rPr>
+      </w:pPr>
+      <w:r>
+        <w:rPr>
+          <w:sz w:val="24"/>
+          <w:szCs w:val="24"/>
+        </w:rPr>
+        <w:drawing>
+          <wp:inline distT="0" distB="0" distL="0" distR="0" wp14:anchorId="27E94346" wp14:editId="3176FE90">
+            <wp:extent cx="4168140" cy="2665467"/>
+            <wp:effectExtent l="0" t="0" r="3810" b="1905"/>
+            <wp:docPr id="129149959" name="Picture 1"/>
+            <wp:cNvGraphicFramePr>
+              <a:graphicFrameLocks xmlns:a="http://schemas.openxmlformats.org/drawingml/2006/main" noChangeAspect="1"/>
+            </wp:cNvGraphicFramePr>
+            <a:graphic xmlns:a="http://schemas.openxmlformats.org/drawingml/2006/main">
+              <a:graphicData uri="http://schemas.openxmlformats.org/drawingml/2006/picture">
+                <pic:pic xmlns:pic="http://schemas.openxmlformats.org/drawingml/2006/picture">
+                  <pic:nvPicPr>
+                    <pic:cNvPr id="129149959" name=""/>
+                    <pic:cNvPicPr/>
+                  </pic:nvPicPr>
+                  <pic:blipFill>
+                    <a:blip r:embed="rId11"/>
+                    <a:stretch>
+                      <a:fillRect/>
+                    </a:stretch>
+                  </pic:blipFill>
+                  <pic:spPr>
+                    <a:xfrm>
+                      <a:off x="0" y="0"/>
+                      <a:ext cx="4176618" cy="2670889"/>
+                    </a:xfrm>
+                    <a:prstGeom prst="rect">
+                      <a:avLst/>
+                    </a:prstGeom>
+                  </pic:spPr>
+                </pic:pic>
+              </a:graphicData>
+            </a:graphic>
+          </wp:inline>
+        </w:drawing>
       </w:r>
     </w:p>
     <w:sectPr>
@@ -14841,6 +13367,7 @@
   <w:style w:type="character" w:default="1" w:styleId="DefaultParagraphFont">
     <w:name w:val="Default Paragraph Font"/>
     <w:uiPriority w:val="1"/>
+    <w:semiHidden/>
     <w:unhideWhenUsed/>
   </w:style>
   <w:style w:type="table" w:default="1" w:styleId="TableNormal">

</xml_diff>